<commit_message>
Add generated screenshots and embed into docx
</commit_message>
<xml_diff>
--- a/11_decision_support/HW3/HOMEWORK3_SUBMISSION.docx
+++ b/11_decision_support/HW3/HOMEWORK3_SUBMISSION.docx
@@ -275,12 +275,135 @@
         <w:t>*(Please insert the following screenshots here before converting to .docx)*</w:t>
       </w:r>
     </w:p>
+    <w:p/>
+    <w:p>
+      <w:pPr>
+        <w:pStyle w:val="ListNumber"/>
+      </w:pPr>
+      <w:r>
+        <w:t>1. **System in Action**: Screenshot of the terminal running `python report_validator.py`.</w:t>
+      </w:r>
+    </w:p>
+    <w:p>
+      <w:r>
+        <w:drawing>
+          <wp:inline xmlns:a="http://schemas.openxmlformats.org/drawingml/2006/main" xmlns:pic="http://schemas.openxmlformats.org/drawingml/2006/picture">
+            <wp:extent cx="5486400" cy="3974400"/>
+            <wp:docPr id="1" name="Picture 1"/>
+            <wp:cNvGraphicFramePr>
+              <a:graphicFrameLocks noChangeAspect="1"/>
+            </wp:cNvGraphicFramePr>
+            <a:graphic>
+              <a:graphicData uri="http://schemas.openxmlformats.org/drawingml/2006/picture">
+                <pic:pic>
+                  <pic:nvPicPr>
+                    <pic:cNvPr id="0" name="screenshot_terminal.png"/>
+                    <pic:cNvPicPr/>
+                  </pic:nvPicPr>
+                  <pic:blipFill>
+                    <a:blip r:embed="rId9"/>
+                    <a:stretch>
+                      <a:fillRect/>
+                    </a:stretch>
+                  </pic:blipFill>
+                  <pic:spPr>
+                    <a:xfrm>
+                      <a:off x="0" y="0"/>
+                      <a:ext cx="5486400" cy="3974400"/>
+                    </a:xfrm>
+                    <a:prstGeom prst="rect"/>
+                  </pic:spPr>
+                </pic:pic>
+              </a:graphicData>
+            </a:graphic>
+          </wp:inline>
+        </w:drawing>
+      </w:r>
+    </w:p>
+    <w:p>
+      <w:r>
+        <w:t>Figure: System in Action</w:t>
+      </w:r>
+    </w:p>
+    <w:p/>
+    <w:p>
+      <w:pPr>
+        <w:pStyle w:val="ListNumber"/>
+      </w:pPr>
+      <w:r>
+        <w:t>2. **Sample Validation Result**: Screenshot of `sample_validation_output.txt` showing the JSON/text output.</w:t>
+      </w:r>
+    </w:p>
+    <w:p>
+      <w:r>
+        <w:drawing>
+          <wp:inline xmlns:a="http://schemas.openxmlformats.org/drawingml/2006/main" xmlns:pic="http://schemas.openxmlformats.org/drawingml/2006/picture">
+            <wp:extent cx="5486400" cy="310029"/>
+            <wp:docPr id="2" name="Picture 2"/>
+            <wp:cNvGraphicFramePr>
+              <a:graphicFrameLocks noChangeAspect="1"/>
+            </wp:cNvGraphicFramePr>
+            <a:graphic>
+              <a:graphicData uri="http://schemas.openxmlformats.org/drawingml/2006/picture">
+                <pic:pic>
+                  <pic:nvPicPr>
+                    <pic:cNvPr id="0" name="screenshot_sample.png"/>
+                    <pic:cNvPicPr/>
+                  </pic:nvPicPr>
+                  <pic:blipFill>
+                    <a:blip r:embed="rId10"/>
+                    <a:stretch>
+                      <a:fillRect/>
+                    </a:stretch>
+                  </pic:blipFill>
+                  <pic:spPr>
+                    <a:xfrm>
+                      <a:off x="0" y="0"/>
+                      <a:ext cx="5486400" cy="310029"/>
+                    </a:xfrm>
+                    <a:prstGeom prst="rect"/>
+                  </pic:spPr>
+                </pic:pic>
+              </a:graphicData>
+            </a:graphic>
+          </wp:inline>
+        </w:drawing>
+      </w:r>
+    </w:p>
+    <w:p>
+      <w:r>
+        <w:t>Figure: Sample Validation Result</w:t>
+      </w:r>
+    </w:p>
+    <w:p/>
+    <w:p>
+      <w:pPr>
+        <w:pStyle w:val="ListNumber"/>
+      </w:pPr>
+      <w:r>
+        <w:t>3. **Statistical Analysis Output**: Screenshot of the console printing the ANOVA F-statistic and p-value.</w:t>
+      </w:r>
+    </w:p>
+    <w:p>
+      <w:r>
+        <w:t>(Included in the System in Action screenshot)</w:t>
+      </w:r>
+    </w:p>
+    <w:p/>
+    <w:p>
+      <w:pPr>
+        <w:pStyle w:val="ListNumber"/>
+      </w:pPr>
+      <w:r>
+        <w:t>4. **Comparison of Scores**: Screenshot of the `validation_results.png` boxplot.</w:t>
+      </w:r>
+    </w:p>
     <w:p>
       <w:r>
         <w:drawing>
           <wp:inline xmlns:a="http://schemas.openxmlformats.org/drawingml/2006/main" xmlns:pic="http://schemas.openxmlformats.org/drawingml/2006/picture">
             <wp:extent cx="5486400" cy="3291840"/>
-            <wp:docPr id="1" name="Picture 1"/>
+            <wp:docPr id="3" name="Picture 3"/>
             <wp:cNvGraphicFramePr>
               <a:graphicFrameLocks noChangeAspect="1"/>
             </wp:cNvGraphicFramePr>
@@ -292,7 +415,7 @@
                     <pic:cNvPicPr/>
                   </pic:nvPicPr>
                   <pic:blipFill>
-                    <a:blip r:embed="rId9"/>
+                    <a:blip r:embed="rId11"/>
                     <a:stretch>
                       <a:fillRect/>
                     </a:stretch>
@@ -313,7 +436,7 @@
     </w:p>
     <w:p>
       <w:r>
-        <w:t>Figure: Validation Results Boxplot</w:t>
+        <w:t>Figure: Comparison of Scores</w:t>
       </w:r>
     </w:p>
     <w:p/>
@@ -322,39 +445,48 @@
         <w:pStyle w:val="ListNumber"/>
       </w:pPr>
       <w:r>
-        <w:t>1. **System in Action**: Screenshot of the terminal running `python report_validator.py`.</w:t>
+        <w:t>5. **Validation Criteria/Rubric**: Screenshot of the Pydantic schema in the code.</w:t>
       </w:r>
     </w:p>
     <w:p>
-      <w:pPr>
-        <w:pStyle w:val="ListNumber"/>
-      </w:pPr>
       <w:r>
-        <w:t>2. **Sample Validation Result**: Screenshot of `sample_validation_output.txt` showing the JSON/text output.</w:t>
+        <w:drawing>
+          <wp:inline xmlns:a="http://schemas.openxmlformats.org/drawingml/2006/main" xmlns:pic="http://schemas.openxmlformats.org/drawingml/2006/picture">
+            <wp:extent cx="5486400" cy="1363081"/>
+            <wp:docPr id="4" name="Picture 4"/>
+            <wp:cNvGraphicFramePr>
+              <a:graphicFrameLocks noChangeAspect="1"/>
+            </wp:cNvGraphicFramePr>
+            <a:graphic>
+              <a:graphicData uri="http://schemas.openxmlformats.org/drawingml/2006/picture">
+                <pic:pic>
+                  <pic:nvPicPr>
+                    <pic:cNvPr id="0" name="screenshot_code.png"/>
+                    <pic:cNvPicPr/>
+                  </pic:nvPicPr>
+                  <pic:blipFill>
+                    <a:blip r:embed="rId12"/>
+                    <a:stretch>
+                      <a:fillRect/>
+                    </a:stretch>
+                  </pic:blipFill>
+                  <pic:spPr>
+                    <a:xfrm>
+                      <a:off x="0" y="0"/>
+                      <a:ext cx="5486400" cy="1363081"/>
+                    </a:xfrm>
+                    <a:prstGeom prst="rect"/>
+                  </pic:spPr>
+                </pic:pic>
+              </a:graphicData>
+            </a:graphic>
+          </wp:inline>
+        </w:drawing>
       </w:r>
     </w:p>
     <w:p>
-      <w:pPr>
-        <w:pStyle w:val="ListNumber"/>
-      </w:pPr>
       <w:r>
-        <w:t>3. **Statistical Analysis Output**: Screenshot of the console printing the ANOVA F-statistic and p-value.</w:t>
-      </w:r>
-    </w:p>
-    <w:p>
-      <w:pPr>
-        <w:pStyle w:val="ListNumber"/>
-      </w:pPr>
-      <w:r>
-        <w:t>4. **Comparison of Scores**: Screenshot of the `validation_results.png` boxplot.</w:t>
-      </w:r>
-    </w:p>
-    <w:p>
-      <w:pPr>
-        <w:pStyle w:val="ListNumber"/>
-      </w:pPr>
-      <w:r>
-        <w:t>5. **Validation Criteria/Rubric**: Screenshot of the Pydantic schema in the code.</w:t>
+        <w:t>Figure: Validation Criteria Code</w:t>
       </w:r>
     </w:p>
     <w:p/>

</xml_diff>

<commit_message>
Update screenshots: split terminal and change sample bg to dark
</commit_message>
<xml_diff>
--- a/11_decision_support/HW3/HOMEWORK3_SUBMISSION.docx
+++ b/11_decision_support/HW3/HOMEWORK3_SUBMISSION.docx
@@ -288,7 +288,7 @@
       <w:r>
         <w:drawing>
           <wp:inline xmlns:a="http://schemas.openxmlformats.org/drawingml/2006/main" xmlns:pic="http://schemas.openxmlformats.org/drawingml/2006/picture">
-            <wp:extent cx="5486400" cy="3974400"/>
+            <wp:extent cx="5486400" cy="2073600"/>
             <wp:docPr id="1" name="Picture 1"/>
             <wp:cNvGraphicFramePr>
               <a:graphicFrameLocks noChangeAspect="1"/>
@@ -297,7 +297,7 @@
               <a:graphicData uri="http://schemas.openxmlformats.org/drawingml/2006/picture">
                 <pic:pic>
                   <pic:nvPicPr>
-                    <pic:cNvPr id="0" name="screenshot_terminal.png"/>
+                    <pic:cNvPr id="0" name="screenshot_terminal_run.png"/>
                     <pic:cNvPicPr/>
                   </pic:nvPicPr>
                   <pic:blipFill>
@@ -309,7 +309,7 @@
                   <pic:spPr>
                     <a:xfrm>
                       <a:off x="0" y="0"/>
-                      <a:ext cx="5486400" cy="3974400"/>
+                      <a:ext cx="5486400" cy="2073600"/>
                     </a:xfrm>
                     <a:prstGeom prst="rect"/>
                   </pic:spPr>
@@ -386,7 +386,43 @@
     </w:p>
     <w:p>
       <w:r>
-        <w:t>(Included in the System in Action screenshot)</w:t>
+        <w:drawing>
+          <wp:inline xmlns:a="http://schemas.openxmlformats.org/drawingml/2006/main" xmlns:pic="http://schemas.openxmlformats.org/drawingml/2006/picture">
+            <wp:extent cx="5486400" cy="2764800"/>
+            <wp:docPr id="3" name="Picture 3"/>
+            <wp:cNvGraphicFramePr>
+              <a:graphicFrameLocks noChangeAspect="1"/>
+            </wp:cNvGraphicFramePr>
+            <a:graphic>
+              <a:graphicData uri="http://schemas.openxmlformats.org/drawingml/2006/picture">
+                <pic:pic>
+                  <pic:nvPicPr>
+                    <pic:cNvPr id="0" name="screenshot_terminal_stats.png"/>
+                    <pic:cNvPicPr/>
+                  </pic:nvPicPr>
+                  <pic:blipFill>
+                    <a:blip r:embed="rId11"/>
+                    <a:stretch>
+                      <a:fillRect/>
+                    </a:stretch>
+                  </pic:blipFill>
+                  <pic:spPr>
+                    <a:xfrm>
+                      <a:off x="0" y="0"/>
+                      <a:ext cx="5486400" cy="2764800"/>
+                    </a:xfrm>
+                    <a:prstGeom prst="rect"/>
+                  </pic:spPr>
+                </pic:pic>
+              </a:graphicData>
+            </a:graphic>
+          </wp:inline>
+        </w:drawing>
+      </w:r>
+    </w:p>
+    <w:p>
+      <w:r>
+        <w:t>Figure: Statistical Output</w:t>
       </w:r>
     </w:p>
     <w:p/>
@@ -403,7 +439,7 @@
         <w:drawing>
           <wp:inline xmlns:a="http://schemas.openxmlformats.org/drawingml/2006/main" xmlns:pic="http://schemas.openxmlformats.org/drawingml/2006/picture">
             <wp:extent cx="5486400" cy="3291840"/>
-            <wp:docPr id="3" name="Picture 3"/>
+            <wp:docPr id="4" name="Picture 4"/>
             <wp:cNvGraphicFramePr>
               <a:graphicFrameLocks noChangeAspect="1"/>
             </wp:cNvGraphicFramePr>
@@ -415,7 +451,7 @@
                     <pic:cNvPicPr/>
                   </pic:nvPicPr>
                   <pic:blipFill>
-                    <a:blip r:embed="rId11"/>
+                    <a:blip r:embed="rId12"/>
                     <a:stretch>
                       <a:fillRect/>
                     </a:stretch>
@@ -453,7 +489,7 @@
         <w:drawing>
           <wp:inline xmlns:a="http://schemas.openxmlformats.org/drawingml/2006/main" xmlns:pic="http://schemas.openxmlformats.org/drawingml/2006/picture">
             <wp:extent cx="5486400" cy="1363081"/>
-            <wp:docPr id="4" name="Picture 4"/>
+            <wp:docPr id="5" name="Picture 5"/>
             <wp:cNvGraphicFramePr>
               <a:graphicFrameLocks noChangeAspect="1"/>
             </wp:cNvGraphicFramePr>
@@ -465,7 +501,7 @@
                     <pic:cNvPicPr/>
                   </pic:nvPicPr>
                   <pic:blipFill>
-                    <a:blip r:embed="rId12"/>
+                    <a:blip r:embed="rId13"/>
                     <a:stretch>
                       <a:fillRect/>
                     </a:stretch>

</xml_diff>

<commit_message>
Wrap text in screenshots so they are readable in Word doc
</commit_message>
<xml_diff>
--- a/11_decision_support/HW3/HOMEWORK3_SUBMISSION.docx
+++ b/11_decision_support/HW3/HOMEWORK3_SUBMISSION.docx
@@ -288,7 +288,7 @@
       <w:r>
         <w:drawing>
           <wp:inline xmlns:a="http://schemas.openxmlformats.org/drawingml/2006/main" xmlns:pic="http://schemas.openxmlformats.org/drawingml/2006/picture">
-            <wp:extent cx="5486400" cy="2073600"/>
+            <wp:extent cx="5486400" cy="1959429"/>
             <wp:docPr id="1" name="Picture 1"/>
             <wp:cNvGraphicFramePr>
               <a:graphicFrameLocks noChangeAspect="1"/>
@@ -309,7 +309,7 @@
                   <pic:spPr>
                     <a:xfrm>
                       <a:off x="0" y="0"/>
-                      <a:ext cx="5486400" cy="2073600"/>
+                      <a:ext cx="5486400" cy="1959429"/>
                     </a:xfrm>
                     <a:prstGeom prst="rect"/>
                   </pic:spPr>
@@ -338,7 +338,7 @@
       <w:r>
         <w:drawing>
           <wp:inline xmlns:a="http://schemas.openxmlformats.org/drawingml/2006/main" xmlns:pic="http://schemas.openxmlformats.org/drawingml/2006/picture">
-            <wp:extent cx="5486400" cy="310029"/>
+            <wp:extent cx="5486400" cy="2621033"/>
             <wp:docPr id="2" name="Picture 2"/>
             <wp:cNvGraphicFramePr>
               <a:graphicFrameLocks noChangeAspect="1"/>
@@ -359,7 +359,7 @@
                   <pic:spPr>
                     <a:xfrm>
                       <a:off x="0" y="0"/>
-                      <a:ext cx="5486400" cy="310029"/>
+                      <a:ext cx="5486400" cy="2621033"/>
                     </a:xfrm>
                     <a:prstGeom prst="rect"/>
                   </pic:spPr>
@@ -388,7 +388,7 @@
       <w:r>
         <w:drawing>
           <wp:inline xmlns:a="http://schemas.openxmlformats.org/drawingml/2006/main" xmlns:pic="http://schemas.openxmlformats.org/drawingml/2006/picture">
-            <wp:extent cx="5486400" cy="2764800"/>
+            <wp:extent cx="5486400" cy="2631233"/>
             <wp:docPr id="3" name="Picture 3"/>
             <wp:cNvGraphicFramePr>
               <a:graphicFrameLocks noChangeAspect="1"/>
@@ -409,7 +409,7 @@
                   <pic:spPr>
                     <a:xfrm>
                       <a:off x="0" y="0"/>
-                      <a:ext cx="5486400" cy="2764800"/>
+                      <a:ext cx="5486400" cy="2631233"/>
                     </a:xfrm>
                     <a:prstGeom prst="rect"/>
                   </pic:spPr>
@@ -488,7 +488,7 @@
       <w:r>
         <w:drawing>
           <wp:inline xmlns:a="http://schemas.openxmlformats.org/drawingml/2006/main" xmlns:pic="http://schemas.openxmlformats.org/drawingml/2006/picture">
-            <wp:extent cx="5486400" cy="1363081"/>
+            <wp:extent cx="5486400" cy="2852928"/>
             <wp:docPr id="5" name="Picture 5"/>
             <wp:cNvGraphicFramePr>
               <a:graphicFrameLocks noChangeAspect="1"/>
@@ -509,7 +509,7 @@
                   <pic:spPr>
                     <a:xfrm>
                       <a:off x="0" y="0"/>
-                      <a:ext cx="5486400" cy="1363081"/>
+                      <a:ext cx="5486400" cy="2852928"/>
                     </a:xfrm>
                     <a:prstGeom prst="rect"/>
                   </pic:spPr>

</xml_diff>

<commit_message>
Strip markdown tags and format word doc properly
</commit_message>
<xml_diff>
--- a/11_decision_support/HW3/HOMEWORK3_SUBMISSION.docx
+++ b/11_decision_support/HW3/HOMEWORK3_SUBMISSION.docx
@@ -36,7 +36,16 @@
     <w:p/>
     <w:p>
       <w:r>
-        <w:t>The system leverages OpenAI's structured outputs (`gpt-4o-mini` with Pydantic JSON schemas) to act as an expert reviewer, analyzing newly generated text without human intervention. This enables large-scale, automated benchmarking of prompt strategies.</w:t>
+        <w:t>The system leverages OpenAI's structured outputs (</w:t>
+      </w:r>
+      <w:r>
+        <w:rPr>
+          <w:rFonts w:ascii="Courier New" w:hAnsi="Courier New"/>
+        </w:rPr>
+        <w:t>gpt-4o-mini</w:t>
+      </w:r>
+      <w:r>
+        <w:t xml:space="preserve"> with Pydantic JSON schemas) to act as an expert reviewer, analyzing newly generated text without human intervention. This enables large-scale, automated benchmarking of prompt strategies.</w:t>
       </w:r>
     </w:p>
     <w:p/>
@@ -50,31 +59,61 @@
     </w:p>
     <w:p>
       <w:r>
-        <w:t>Unlike the standard Likert scales from the LAB, this validator is tailored specifically for **Business Data Analysis Reports**. I customized the validator to use a 1-10 scoring system across three distinct, business-focused criteria:</w:t>
+        <w:t xml:space="preserve">Unlike the standard Likert scales from the LAB, this validator is tailored specifically for </w:t>
+      </w:r>
+      <w:r>
+        <w:rPr>
+          <w:b/>
+        </w:rPr>
+        <w:t>Business Data Analysis Reports</w:t>
+      </w:r>
+      <w:r>
+        <w:t>. I customized the validator to use a 1-10 scoring system across three distinct, business-focused criteria:</w:t>
       </w:r>
     </w:p>
     <w:p>
       <w:pPr>
         <w:pStyle w:val="ListNumber"/>
       </w:pPr>
+      <w:r/>
       <w:r>
-        <w:t>1. **Actionability**: Measures whether the report offers clear, practical recommendations or just repeats the data.</w:t>
+        <w:rPr>
+          <w:b/>
+        </w:rPr>
+        <w:t>Actionability</w:t>
+      </w:r>
+      <w:r>
+        <w:t>: Measures whether the report offers clear, practical recommendations or just repeats the data.</w:t>
       </w:r>
     </w:p>
     <w:p>
       <w:pPr>
         <w:pStyle w:val="ListNumber"/>
       </w:pPr>
+      <w:r/>
       <w:r>
-        <w:t>2. **Depth of Analysis**: Evaluates how well the data is interpreted contextually.</w:t>
+        <w:rPr>
+          <w:b/>
+        </w:rPr>
+        <w:t>Depth of Analysis</w:t>
+      </w:r>
+      <w:r>
+        <w:t>: Evaluates how well the data is interpreted contextually.</w:t>
       </w:r>
     </w:p>
     <w:p>
       <w:pPr>
         <w:pStyle w:val="ListNumber"/>
       </w:pPr>
+      <w:r/>
       <w:r>
-        <w:t>3. **Professional Tone**: Assesses whether the language is suitable for executive leadership.</w:t>
+        <w:rPr>
+          <w:b/>
+        </w:rPr>
+        <w:t>Professional Tone</w:t>
+      </w:r>
+      <w:r>
+        <w:t>: Assesses whether the language is suitable for executive leadership.</w:t>
       </w:r>
     </w:p>
     <w:p>
@@ -100,30 +139,78 @@
       <w:pPr>
         <w:pStyle w:val="ListBullet"/>
       </w:pPr>
+      <w:r/>
       <w:r>
-        <w:t>* **Prompt A (Basic)**: Asked for a simple report about a 15% increase in Metric A and variance in Metric C.</w:t>
+        <w:rPr>
+          <w:b/>
+        </w:rPr>
+        <w:t>Prompt A (Basic)</w:t>
+      </w:r>
+      <w:r>
+        <w:t>: Asked for a simple report about a 15% increase in Metric A and variance in Metric C.</w:t>
       </w:r>
     </w:p>
     <w:p>
       <w:pPr>
         <w:pStyle w:val="ListBullet"/>
       </w:pPr>
+      <w:r/>
       <w:r>
-        <w:t>* **Prompt B (Detailed)**: Asked for a structured report with an Introduction, Body, and Conclusion.</w:t>
+        <w:rPr>
+          <w:b/>
+        </w:rPr>
+        <w:t>Prompt B (Detailed)</w:t>
+      </w:r>
+      <w:r>
+        <w:t>: Asked for a structured report with an Introduction, Body, and Conclusion.</w:t>
       </w:r>
     </w:p>
     <w:p>
       <w:pPr>
         <w:pStyle w:val="ListBullet"/>
       </w:pPr>
+      <w:r/>
       <w:r>
-        <w:t>* **Prompt C (Expert)**: Asked for an expert-level, highly actionable report for executive leadership focusing on strategic recommendations and risk mitigation.</w:t>
+        <w:rPr>
+          <w:b/>
+        </w:rPr>
+        <w:t>Prompt C (Expert)</w:t>
+      </w:r>
+      <w:r>
+        <w:t>: Asked for an expert-level, highly actionable report for executive leadership focusing on strategic recommendations and risk mitigation.</w:t>
       </w:r>
     </w:p>
     <w:p/>
     <w:p>
       <w:r>
-        <w:t>I generated **10 unique reports** for each prompt (total N=30) by using a temperature of `0.8` to introduce variance. Each report was then passed through the custom validation system (with a temperature of `0.0` for consistency).</w:t>
+        <w:t xml:space="preserve">I generated </w:t>
+      </w:r>
+      <w:r>
+        <w:rPr>
+          <w:b/>
+        </w:rPr>
+        <w:t>10 unique reports</w:t>
+      </w:r>
+      <w:r>
+        <w:t xml:space="preserve"> for each prompt (total N=30) by using a temperature of </w:t>
+      </w:r>
+      <w:r>
+        <w:rPr>
+          <w:rFonts w:ascii="Courier New" w:hAnsi="Courier New"/>
+        </w:rPr>
+        <w:t>0.8</w:t>
+      </w:r>
+      <w:r>
+        <w:t xml:space="preserve"> to introduce variance. Each report was then passed through the custom validation system (with a temperature of </w:t>
+      </w:r>
+      <w:r>
+        <w:rPr>
+          <w:rFonts w:ascii="Courier New" w:hAnsi="Courier New"/>
+        </w:rPr>
+        <w:t>0.0</w:t>
+      </w:r>
+      <w:r>
+        <w:t xml:space="preserve"> for consistency).</w:t>
       </w:r>
     </w:p>
     <w:p/>
@@ -137,53 +224,102 @@
     </w:p>
     <w:p>
       <w:r>
-        <w:t>To determine if there was a statistically significant difference in performance across the three prompts, I ran an Analysis of Variance (ANOVA) on the `Total_Score` (out of 30).</w:t>
+        <w:t xml:space="preserve">To determine if there was a statistically significant difference in performance across the three prompts, I ran an Analysis of Variance (ANOVA) on the </w:t>
+      </w:r>
+      <w:r>
+        <w:rPr>
+          <w:rFonts w:ascii="Courier New" w:hAnsi="Courier New"/>
+        </w:rPr>
+        <w:t>Total_Score</w:t>
+      </w:r>
+      <w:r>
+        <w:t xml:space="preserve"> (out of 30).</w:t>
       </w:r>
     </w:p>
     <w:p/>
     <w:p>
+      <w:r/>
       <w:r>
-        <w:t>**Results:**</w:t>
+        <w:rPr>
+          <w:b/>
+        </w:rPr>
+        <w:t>Results:</w:t>
+      </w:r>
+      <w:r/>
+    </w:p>
+    <w:p>
+      <w:pPr>
+        <w:pStyle w:val="ListBullet"/>
+      </w:pPr>
+      <w:r/>
+      <w:r>
+        <w:rPr>
+          <w:b/>
+        </w:rPr>
+        <w:t>Prompt A Mean Score</w:t>
+      </w:r>
+      <w:r>
+        <w:t>: 25.0 / 30</w:t>
       </w:r>
     </w:p>
     <w:p>
       <w:pPr>
         <w:pStyle w:val="ListBullet"/>
       </w:pPr>
+      <w:r/>
       <w:r>
-        <w:t>* **Prompt A Mean Score**: 25.0 / 30</w:t>
+        <w:rPr>
+          <w:b/>
+        </w:rPr>
+        <w:t>Prompt B Mean Score</w:t>
+      </w:r>
+      <w:r>
+        <w:t>: 25.6 / 30</w:t>
       </w:r>
     </w:p>
     <w:p>
       <w:pPr>
         <w:pStyle w:val="ListBullet"/>
       </w:pPr>
+      <w:r/>
       <w:r>
-        <w:t>* **Prompt B Mean Score**: 25.6 / 30</w:t>
+        <w:rPr>
+          <w:b/>
+        </w:rPr>
+        <w:t>Prompt C Mean Score</w:t>
+      </w:r>
+      <w:r>
+        <w:t>: 26.0 / 30</w:t>
       </w:r>
     </w:p>
     <w:p>
       <w:pPr>
         <w:pStyle w:val="ListBullet"/>
       </w:pPr>
+      <w:r/>
       <w:r>
-        <w:t>* **Prompt C Mean Score**: 26.0 / 30</w:t>
+        <w:rPr>
+          <w:b/>
+        </w:rPr>
+        <w:t>F-statistic</w:t>
+      </w:r>
+      <w:r>
+        <w:t>: 4.1707</w:t>
       </w:r>
     </w:p>
     <w:p>
       <w:pPr>
         <w:pStyle w:val="ListBullet"/>
       </w:pPr>
+      <w:r/>
       <w:r>
-        <w:t>* **F-statistic**: 4.1707</w:t>
+        <w:rPr>
+          <w:b/>
+        </w:rPr>
+        <w:t>P-value</w:t>
       </w:r>
-    </w:p>
-    <w:p>
-      <w:pPr>
-        <w:pStyle w:val="ListBullet"/>
-      </w:pPr>
       <w:r>
-        <w:t>* **P-value**: 0.0264</w:t>
+        <w:t>: 0.0264</w:t>
       </w:r>
     </w:p>
     <w:p/>
@@ -203,7 +339,34 @@
     </w:p>
     <w:p>
       <w:r>
-        <w:t>One challenge was ensuring the LLM evaluator remained consistent in its scoring. To mitigate evaluator drift, I used the `response_format` JSON schema feature via Pydantic to force the LLM to output precise integers between 1 and 10 and include a `reasoning` field. The reasoning field forces "chain-of-thought" logic before the final numbers are assigned, improving evaluation consistency. I also set the evaluator temperature to `0.0`. Another design choice was generating the 30 reports programmatically to ensure a large enough sample size for the ANOVA test, rather than manually evaluating just one or two old homework files.</w:t>
+        <w:t xml:space="preserve">One challenge was ensuring the LLM evaluator remained consistent in its scoring. To mitigate evaluator drift, I used the </w:t>
+      </w:r>
+      <w:r>
+        <w:rPr>
+          <w:rFonts w:ascii="Courier New" w:hAnsi="Courier New"/>
+        </w:rPr>
+        <w:t>response_format</w:t>
+      </w:r>
+      <w:r>
+        <w:t xml:space="preserve"> JSON schema feature via Pydantic to force the LLM to output precise integers between 1 and 10 and include a </w:t>
+      </w:r>
+      <w:r>
+        <w:rPr>
+          <w:rFonts w:ascii="Courier New" w:hAnsi="Courier New"/>
+        </w:rPr>
+        <w:t>reasoning</w:t>
+      </w:r>
+      <w:r>
+        <w:t xml:space="preserve"> field. The reasoning field forces "chain-of-thought" logic before the final numbers are assigned, improving evaluation consistency. I also set the evaluator temperature to </w:t>
+      </w:r>
+      <w:r>
+        <w:rPr>
+          <w:rFonts w:ascii="Courier New" w:hAnsi="Courier New"/>
+        </w:rPr>
+        <w:t>0.0</w:t>
+      </w:r>
+      <w:r>
+        <w:t>. Another design choice was generating the 30 reports programmatically to ensure a large enough sample size for the ANOVA test, rather than manually evaluating just one or two old homework files.</w:t>
       </w:r>
     </w:p>
     <w:p/>
@@ -226,32 +389,78 @@
       <w:pPr>
         <w:pStyle w:val="ListBullet"/>
       </w:pPr>
+      <w:r/>
       <w:r>
-        <w:t>* **Validation System Script (`report_validator.py`)**: https://github.com/datik01/SYSEN5381-DSAI/blob/main/11_decision_support/HW3/report_validator.py</w:t>
+        <w:rPr>
+          <w:b/>
+        </w:rPr>
+        <w:t>Validation System Script (`report_validator.py`)</w:t>
+      </w:r>
+      <w:r>
+        <w:t>: https://github.com/datik01/SYSEN5381-DSAI/blob/main/11_decision_support/HW3/report_validator.py</w:t>
       </w:r>
     </w:p>
     <w:p>
       <w:pPr>
         <w:pStyle w:val="ListBullet"/>
       </w:pPr>
+      <w:r/>
       <w:r>
-        <w:t>* **Validation Criteria Definition**: Defined within the script as a Pydantic `ValidationResult` schema and the `validate_report` system prompt.</w:t>
+        <w:rPr>
+          <w:b/>
+        </w:rPr>
+        <w:t>Validation Criteria Definition</w:t>
+      </w:r>
+      <w:r>
+        <w:t xml:space="preserve">: Defined within the script as a Pydantic </w:t>
+      </w:r>
+      <w:r>
+        <w:rPr>
+          <w:rFonts w:ascii="Courier New" w:hAnsi="Courier New"/>
+        </w:rPr>
+        <w:t>ValidationResult</w:t>
+      </w:r>
+      <w:r>
+        <w:t xml:space="preserve"> schema and the </w:t>
+      </w:r>
+      <w:r>
+        <w:rPr>
+          <w:rFonts w:ascii="Courier New" w:hAnsi="Courier New"/>
+        </w:rPr>
+        <w:t>validate_report</w:t>
+      </w:r>
+      <w:r>
+        <w:t xml:space="preserve"> system prompt.</w:t>
       </w:r>
     </w:p>
     <w:p>
       <w:pPr>
         <w:pStyle w:val="ListBullet"/>
       </w:pPr>
+      <w:r/>
       <w:r>
-        <w:t>* **Example Validation Outputs**: https://github.com/datik01/SYSEN5381-DSAI/blob/main/11_decision_support/HW3/validation_results.csv</w:t>
+        <w:rPr>
+          <w:b/>
+        </w:rPr>
+        <w:t>Example Validation Outputs</w:t>
+      </w:r>
+      <w:r>
+        <w:t>: https://github.com/datik01/SYSEN5381-DSAI/blob/main/11_decision_support/HW3/validation_results.csv</w:t>
       </w:r>
     </w:p>
     <w:p>
       <w:pPr>
         <w:pStyle w:val="ListBullet"/>
       </w:pPr>
+      <w:r/>
       <w:r>
-        <w:t>* **Validated Reports**: https://github.com/datik01/SYSEN5381-DSAI/tree/main/11_decision_support/HW3/reports</w:t>
+        <w:rPr>
+          <w:b/>
+        </w:rPr>
+        <w:t>Validated Reports</w:t>
+      </w:r>
+      <w:r>
+        <w:t>: https://github.com/datik01/SYSEN5381-DSAI/tree/main/11_decision_support/HW3/reports</w:t>
       </w:r>
     </w:p>
     <w:p/>
@@ -271,17 +480,38 @@
     </w:p>
     <w:p/>
     <w:p>
+      <w:r/>
       <w:r>
-        <w:t>*(Please insert the following screenshots here before converting to .docx)*</w:t>
+        <w:rPr>
+          <w:i/>
+        </w:rPr>
+        <w:t>(Please insert the following screenshots here before converting to .docx)</w:t>
       </w:r>
+      <w:r/>
     </w:p>
     <w:p/>
     <w:p>
       <w:pPr>
         <w:pStyle w:val="ListNumber"/>
       </w:pPr>
+      <w:r/>
       <w:r>
-        <w:t>1. **System in Action**: Screenshot of the terminal running `python report_validator.py`.</w:t>
+        <w:rPr>
+          <w:b/>
+        </w:rPr>
+        <w:t>System in Action</w:t>
+      </w:r>
+      <w:r>
+        <w:t xml:space="preserve">: Screenshot of the terminal running </w:t>
+      </w:r>
+      <w:r>
+        <w:rPr>
+          <w:rFonts w:ascii="Courier New" w:hAnsi="Courier New"/>
+        </w:rPr>
+        <w:t>python report_validator.py</w:t>
+      </w:r>
+      <w:r>
+        <w:t>.</w:t>
       </w:r>
     </w:p>
     <w:p>
@@ -330,8 +560,24 @@
       <w:pPr>
         <w:pStyle w:val="ListNumber"/>
       </w:pPr>
+      <w:r/>
       <w:r>
-        <w:t>2. **Sample Validation Result**: Screenshot of `sample_validation_output.txt` showing the JSON/text output.</w:t>
+        <w:rPr>
+          <w:b/>
+        </w:rPr>
+        <w:t>Sample Validation Result</w:t>
+      </w:r>
+      <w:r>
+        <w:t xml:space="preserve">: Screenshot of </w:t>
+      </w:r>
+      <w:r>
+        <w:rPr>
+          <w:rFonts w:ascii="Courier New" w:hAnsi="Courier New"/>
+        </w:rPr>
+        <w:t>sample_validation_output.txt</w:t>
+      </w:r>
+      <w:r>
+        <w:t xml:space="preserve"> showing the JSON/text output.</w:t>
       </w:r>
     </w:p>
     <w:p>
@@ -380,8 +626,15 @@
       <w:pPr>
         <w:pStyle w:val="ListNumber"/>
       </w:pPr>
+      <w:r/>
       <w:r>
-        <w:t>3. **Statistical Analysis Output**: Screenshot of the console printing the ANOVA F-statistic and p-value.</w:t>
+        <w:rPr>
+          <w:b/>
+        </w:rPr>
+        <w:t>Statistical Analysis Output</w:t>
+      </w:r>
+      <w:r>
+        <w:t>: Screenshot of the console printing the ANOVA F-statistic and p-value.</w:t>
       </w:r>
     </w:p>
     <w:p>
@@ -430,8 +683,24 @@
       <w:pPr>
         <w:pStyle w:val="ListNumber"/>
       </w:pPr>
+      <w:r/>
       <w:r>
-        <w:t>4. **Comparison of Scores**: Screenshot of the `validation_results.png` boxplot.</w:t>
+        <w:rPr>
+          <w:b/>
+        </w:rPr>
+        <w:t>Comparison of Scores</w:t>
+      </w:r>
+      <w:r>
+        <w:t xml:space="preserve">: Screenshot of the </w:t>
+      </w:r>
+      <w:r>
+        <w:rPr>
+          <w:rFonts w:ascii="Courier New" w:hAnsi="Courier New"/>
+        </w:rPr>
+        <w:t>validation_results.png</w:t>
+      </w:r>
+      <w:r>
+        <w:t xml:space="preserve"> boxplot.</w:t>
       </w:r>
     </w:p>
     <w:p>
@@ -480,8 +749,15 @@
       <w:pPr>
         <w:pStyle w:val="ListNumber"/>
       </w:pPr>
+      <w:r/>
       <w:r>
-        <w:t>5. **Validation Criteria/Rubric**: Screenshot of the Pydantic schema in the code.</w:t>
+        <w:rPr>
+          <w:b/>
+        </w:rPr>
+        <w:t>Validation Criteria/Rubric</w:t>
+      </w:r>
+      <w:r>
+        <w:t>: Screenshot of the Pydantic schema in the code.</w:t>
       </w:r>
     </w:p>
     <w:p>
@@ -562,23 +838,57 @@
     </w:p>
     <w:p>
       <w:r>
-        <w:t>| **Actionability** | Evaluates if recommendations are clear and practical. | 1-10 Scale (AI Evaluator) | 8+ required for production reports. |</w:t>
+        <w:t xml:space="preserve">| </w:t>
+      </w:r>
+      <w:r>
+        <w:rPr>
+          <w:b/>
+        </w:rPr>
+        <w:t>Actionability</w:t>
+      </w:r>
+      <w:r>
+        <w:t xml:space="preserve"> | Evaluates if recommendations are clear and practical. | 1-10 Scale (AI Evaluator) | 8+ required for production reports. |</w:t>
       </w:r>
     </w:p>
     <w:p>
       <w:r>
-        <w:t>| **Depth of Analysis** | Evaluates interpretation of data beyond just repeating numbers. | 1-10 Scale (AI Evaluator) | 7+ required for analytical depth. |</w:t>
+        <w:t xml:space="preserve">| </w:t>
+      </w:r>
+      <w:r>
+        <w:rPr>
+          <w:b/>
+        </w:rPr>
+        <w:t>Depth of Analysis</w:t>
+      </w:r>
+      <w:r>
+        <w:t xml:space="preserve"> | Evaluates interpretation of data beyond just repeating numbers. | 1-10 Scale (AI Evaluator) | 7+ required for analytical depth. |</w:t>
       </w:r>
     </w:p>
     <w:p>
       <w:r>
-        <w:t>| **Professional Tone** | Evaluates suitability for executive leadership. | 1-10 Scale (AI Evaluator) | 9+ required for client-facing content. |</w:t>
+        <w:t xml:space="preserve">| </w:t>
+      </w:r>
+      <w:r>
+        <w:rPr>
+          <w:b/>
+        </w:rPr>
+        <w:t>Professional Tone</w:t>
+      </w:r>
+      <w:r>
+        <w:t xml:space="preserve"> | Evaluates suitability for executive leadership. | 1-10 Scale (AI Evaluator) | 9+ required for client-facing content. |</w:t>
       </w:r>
     </w:p>
     <w:p/>
     <w:p>
+      <w:r/>
       <w:r>
-        <w:t>*How it differs from LAB:* Instead of generic 1-5 Likert scales evaluating "Clarity" and "Relevance", this rubric uses a 1-10 scale heavily focused on business intelligence constraints (actionability and executive tone).</w:t>
+        <w:rPr>
+          <w:i/>
+        </w:rPr>
+        <w:t>How it differs from LAB:</w:t>
+      </w:r>
+      <w:r>
+        <w:t xml:space="preserve"> Instead of generic 1-5 Likert scales evaluating "Clarity" and "Relevance", this rubric uses a 1-10 scale heavily focused on business intelligence constraints (actionability and executive tone).</w:t>
       </w:r>
     </w:p>
     <w:p/>
@@ -594,16 +904,30 @@
       <w:pPr>
         <w:pStyle w:val="ListBullet"/>
       </w:pPr>
+      <w:r/>
       <w:r>
-        <w:t>* **Prompts Compared**: Prompt A (Basic), Prompt B (Detailed), Prompt C (Expert Persona).</w:t>
+        <w:rPr>
+          <w:b/>
+        </w:rPr>
+        <w:t>Prompts Compared</w:t>
+      </w:r>
+      <w:r>
+        <w:t>: Prompt A (Basic), Prompt B (Detailed), Prompt C (Expert Persona).</w:t>
       </w:r>
     </w:p>
     <w:p>
       <w:pPr>
         <w:pStyle w:val="ListBullet"/>
       </w:pPr>
+      <w:r/>
       <w:r>
-        <w:t>* **Sample Size**: 10 generated reports per prompt, yielding a total of 30 validation scores (N=30).</w:t>
+        <w:rPr>
+          <w:b/>
+        </w:rPr>
+        <w:t>Sample Size</w:t>
+      </w:r>
+      <w:r>
+        <w:t>: 10 generated reports per prompt, yielding a total of 30 validation scores (N=30).</w:t>
       </w:r>
     </w:p>
     <w:p/>
@@ -619,24 +943,54 @@
       <w:pPr>
         <w:pStyle w:val="ListBullet"/>
       </w:pPr>
+      <w:r/>
       <w:r>
-        <w:t>* **Test Used**: One-way ANOVA (`scipy.stats.f_oneway`).</w:t>
+        <w:rPr>
+          <w:b/>
+        </w:rPr>
+        <w:t>Test Used</w:t>
+      </w:r>
+      <w:r>
+        <w:t>: One-way ANOVA (</w:t>
+      </w:r>
+      <w:r>
+        <w:rPr>
+          <w:rFonts w:ascii="Courier New" w:hAnsi="Courier New"/>
+        </w:rPr>
+        <w:t>scipy.stats.f_oneway</w:t>
+      </w:r>
+      <w:r>
+        <w:t>).</w:t>
       </w:r>
     </w:p>
     <w:p>
       <w:pPr>
         <w:pStyle w:val="ListBullet"/>
       </w:pPr>
+      <w:r/>
       <w:r>
-        <w:t>* **Hypothesis (H0)**: There is no difference in the mean total validation score among the three prompt strategies.</w:t>
+        <w:rPr>
+          <w:b/>
+        </w:rPr>
+        <w:t>Hypothesis (H0)</w:t>
+      </w:r>
+      <w:r>
+        <w:t>: There is no difference in the mean total validation score among the three prompt strategies.</w:t>
       </w:r>
     </w:p>
     <w:p>
       <w:pPr>
         <w:pStyle w:val="ListBullet"/>
       </w:pPr>
+      <w:r/>
       <w:r>
-        <w:t>* **Results &amp; Interpretation**: The p-value was significantly below 0.05, allowing us to reject the null hypothesis. The results prove that prompt engineering directly and measurably affects the quality of generated reports.</w:t>
+        <w:rPr>
+          <w:b/>
+        </w:rPr>
+        <w:t>Results &amp; Interpretation</w:t>
+      </w:r>
+      <w:r>
+        <w:t>: The p-value was significantly below 0.05, allowing us to reject the null hypothesis. The results prove that prompt engineering directly and measurably affects the quality of generated reports.</w:t>
       </w:r>
     </w:p>
     <w:p/>
@@ -650,7 +1004,16 @@
     </w:p>
     <w:p>
       <w:r>
-        <w:t>The system uses an **Agentic Loop**: a "Generator" AI creates the reports with high temperature (0.8) for creativity, and a "Reviewer" AI evaluates them with zero temperature (0.0) for deterministic consistency. The Reviewer's outputs are strictly enforced using Pydantic JSON schemas.</w:t>
+        <w:t xml:space="preserve">The system uses an </w:t>
+      </w:r>
+      <w:r>
+        <w:rPr>
+          <w:b/>
+        </w:rPr>
+        <w:t>Agentic Loop</w:t>
+      </w:r>
+      <w:r>
+        <w:t>: a "Generator" AI creates the reports with high temperature (0.8) for creativity, and a "Reviewer" AI evaluates them with zero temperature (0.0) for deterministic consistency. The Reviewer's outputs are strictly enforced using Pydantic JSON schemas.</w:t>
       </w:r>
     </w:p>
     <w:p/>
@@ -666,24 +1029,117 @@
       <w:pPr>
         <w:pStyle w:val="ListBullet"/>
       </w:pPr>
+      <w:r/>
       <w:r>
-        <w:t>* **Language**: Python 3.9+</w:t>
+        <w:rPr>
+          <w:b/>
+        </w:rPr>
+        <w:t>Language</w:t>
+      </w:r>
+      <w:r>
+        <w:t>: Python 3.9+</w:t>
       </w:r>
     </w:p>
     <w:p>
       <w:pPr>
         <w:pStyle w:val="ListBullet"/>
       </w:pPr>
+      <w:r/>
       <w:r>
-        <w:t>* **Dependencies**: `openai`, `pandas`, `scipy`, `matplotlib`, `seaborn`, `pydantic`.</w:t>
+        <w:rPr>
+          <w:b/>
+        </w:rPr>
+        <w:t>Dependencies</w:t>
+      </w:r>
+      <w:r>
+        <w:t xml:space="preserve">: </w:t>
+      </w:r>
+      <w:r>
+        <w:rPr>
+          <w:rFonts w:ascii="Courier New" w:hAnsi="Courier New"/>
+        </w:rPr>
+        <w:t>openai</w:t>
+      </w:r>
+      <w:r>
+        <w:t xml:space="preserve">, </w:t>
+      </w:r>
+      <w:r>
+        <w:rPr>
+          <w:rFonts w:ascii="Courier New" w:hAnsi="Courier New"/>
+        </w:rPr>
+        <w:t>pandas</w:t>
+      </w:r>
+      <w:r>
+        <w:t xml:space="preserve">, </w:t>
+      </w:r>
+      <w:r>
+        <w:rPr>
+          <w:rFonts w:ascii="Courier New" w:hAnsi="Courier New"/>
+        </w:rPr>
+        <w:t>scipy</w:t>
+      </w:r>
+      <w:r>
+        <w:t xml:space="preserve">, </w:t>
+      </w:r>
+      <w:r>
+        <w:rPr>
+          <w:rFonts w:ascii="Courier New" w:hAnsi="Courier New"/>
+        </w:rPr>
+        <w:t>matplotlib</w:t>
+      </w:r>
+      <w:r>
+        <w:t xml:space="preserve">, </w:t>
+      </w:r>
+      <w:r>
+        <w:rPr>
+          <w:rFonts w:ascii="Courier New" w:hAnsi="Courier New"/>
+        </w:rPr>
+        <w:t>seaborn</w:t>
+      </w:r>
+      <w:r>
+        <w:t xml:space="preserve">, </w:t>
+      </w:r>
+      <w:r>
+        <w:rPr>
+          <w:rFonts w:ascii="Courier New" w:hAnsi="Courier New"/>
+        </w:rPr>
+        <w:t>pydantic</w:t>
+      </w:r>
+      <w:r>
+        <w:t>.</w:t>
       </w:r>
     </w:p>
     <w:p>
       <w:pPr>
         <w:pStyle w:val="ListBullet"/>
       </w:pPr>
+      <w:r/>
       <w:r>
-        <w:t>* **API**: Requires `OPENAI_API_KEY` stored in a `.env` file.</w:t>
+        <w:rPr>
+          <w:b/>
+        </w:rPr>
+        <w:t>API</w:t>
+      </w:r>
+      <w:r>
+        <w:t xml:space="preserve">: Requires </w:t>
+      </w:r>
+      <w:r>
+        <w:rPr>
+          <w:rFonts w:ascii="Courier New" w:hAnsi="Courier New"/>
+        </w:rPr>
+        <w:t>OPENAI_API_KEY</w:t>
+      </w:r>
+      <w:r>
+        <w:t xml:space="preserve"> stored in a </w:t>
+      </w:r>
+      <w:r>
+        <w:rPr>
+          <w:rFonts w:ascii="Courier New" w:hAnsi="Courier New"/>
+        </w:rPr>
+        <w:t>.env</w:t>
+      </w:r>
+      <w:r>
+        <w:t xml:space="preserve"> file.</w:t>
       </w:r>
     </w:p>
     <w:p/>
@@ -700,7 +1156,31 @@
         <w:pStyle w:val="ListNumber"/>
       </w:pPr>
       <w:r>
-        <w:t>1. Install dependencies: `pip install openai pandas scipy matplotlib seaborn pydantic python-dotenv`</w:t>
+        <w:t xml:space="preserve">Install dependencies: </w:t>
+      </w:r>
+      <w:r>
+        <w:rPr>
+          <w:rFonts w:ascii="Courier New" w:hAnsi="Courier New"/>
+        </w:rPr>
+        <w:t>pip install openai pandas scipy matplotlib seaborn pydantic python-dotenv</w:t>
+      </w:r>
+      <w:r/>
+    </w:p>
+    <w:p>
+      <w:pPr>
+        <w:pStyle w:val="ListNumber"/>
+      </w:pPr>
+      <w:r>
+        <w:t xml:space="preserve">Ensure your OpenAI API key is in a </w:t>
+      </w:r>
+      <w:r>
+        <w:rPr>
+          <w:rFonts w:ascii="Courier New" w:hAnsi="Courier New"/>
+        </w:rPr>
+        <w:t>.env</w:t>
+      </w:r>
+      <w:r>
+        <w:t xml:space="preserve"> file in the project root.</w:t>
       </w:r>
     </w:p>
     <w:p>
@@ -708,23 +1188,49 @@
         <w:pStyle w:val="ListNumber"/>
       </w:pPr>
       <w:r>
-        <w:t>2. Ensure your OpenAI API key is in a `.env` file in the project root.</w:t>
+        <w:t xml:space="preserve">Run the script: </w:t>
       </w:r>
+      <w:r>
+        <w:rPr>
+          <w:rFonts w:ascii="Courier New" w:hAnsi="Courier New"/>
+        </w:rPr>
+        <w:t>python report_validator.py</w:t>
+      </w:r>
+      <w:r/>
     </w:p>
     <w:p>
       <w:pPr>
         <w:pStyle w:val="ListNumber"/>
       </w:pPr>
       <w:r>
-        <w:t>3. Run the script: `python report_validator.py`</w:t>
+        <w:t xml:space="preserve">The system will create a </w:t>
       </w:r>
-    </w:p>
-    <w:p>
-      <w:pPr>
-        <w:pStyle w:val="ListNumber"/>
-      </w:pPr>
       <w:r>
-        <w:t>4. The system will create a `reports/` folder, save the generated text files, output a `validation_results.csv`, print the ANOVA statistics to the console, and generate a `validation_results.png` boxplot.</w:t>
+        <w:rPr>
+          <w:rFonts w:ascii="Courier New" w:hAnsi="Courier New"/>
+        </w:rPr>
+        <w:t>reports/</w:t>
+      </w:r>
+      <w:r>
+        <w:t xml:space="preserve"> folder, save the generated text files, output a </w:t>
+      </w:r>
+      <w:r>
+        <w:rPr>
+          <w:rFonts w:ascii="Courier New" w:hAnsi="Courier New"/>
+        </w:rPr>
+        <w:t>validation_results.csv</w:t>
+      </w:r>
+      <w:r>
+        <w:t xml:space="preserve">, print the ANOVA statistics to the console, and generate a </w:t>
+      </w:r>
+      <w:r>
+        <w:rPr>
+          <w:rFonts w:ascii="Courier New" w:hAnsi="Courier New"/>
+        </w:rPr>
+        <w:t>validation_results.png</w:t>
+      </w:r>
+      <w:r>
+        <w:t xml:space="preserve"> boxplot.</w:t>
       </w:r>
     </w:p>
     <w:sectPr>

</xml_diff>

<commit_message>
Fix list numbering issue in word doc converter
</commit_message>
<xml_diff>
--- a/11_decision_support/HW3/HOMEWORK3_SUBMISSION.docx
+++ b/11_decision_support/HW3/HOMEWORK3_SUBMISSION.docx
@@ -72,10 +72,9 @@
       </w:r>
     </w:p>
     <w:p>
-      <w:pPr>
-        <w:pStyle w:val="ListNumber"/>
-      </w:pPr>
-      <w:r/>
+      <w:r>
+        <w:t xml:space="preserve">1. </w:t>
+      </w:r>
       <w:r>
         <w:rPr>
           <w:b/>
@@ -87,10 +86,9 @@
       </w:r>
     </w:p>
     <w:p>
-      <w:pPr>
-        <w:pStyle w:val="ListNumber"/>
-      </w:pPr>
-      <w:r/>
+      <w:r>
+        <w:t xml:space="preserve">2. </w:t>
+      </w:r>
       <w:r>
         <w:rPr>
           <w:b/>
@@ -102,10 +100,9 @@
       </w:r>
     </w:p>
     <w:p>
-      <w:pPr>
-        <w:pStyle w:val="ListNumber"/>
-      </w:pPr>
-      <w:r/>
+      <w:r>
+        <w:t xml:space="preserve">3. </w:t>
+      </w:r>
       <w:r>
         <w:rPr>
           <w:b/>
@@ -491,10 +488,9 @@
     </w:p>
     <w:p/>
     <w:p>
-      <w:pPr>
-        <w:pStyle w:val="ListNumber"/>
-      </w:pPr>
-      <w:r/>
+      <w:r>
+        <w:t xml:space="preserve">1. </w:t>
+      </w:r>
       <w:r>
         <w:rPr>
           <w:b/>
@@ -557,10 +553,9 @@
     </w:p>
     <w:p/>
     <w:p>
-      <w:pPr>
-        <w:pStyle w:val="ListNumber"/>
-      </w:pPr>
-      <w:r/>
+      <w:r>
+        <w:t xml:space="preserve">2. </w:t>
+      </w:r>
       <w:r>
         <w:rPr>
           <w:b/>
@@ -623,10 +618,9 @@
     </w:p>
     <w:p/>
     <w:p>
-      <w:pPr>
-        <w:pStyle w:val="ListNumber"/>
-      </w:pPr>
-      <w:r/>
+      <w:r>
+        <w:t xml:space="preserve">3. </w:t>
+      </w:r>
       <w:r>
         <w:rPr>
           <w:b/>
@@ -680,10 +674,9 @@
     </w:p>
     <w:p/>
     <w:p>
-      <w:pPr>
-        <w:pStyle w:val="ListNumber"/>
-      </w:pPr>
-      <w:r/>
+      <w:r>
+        <w:t xml:space="preserve">4. </w:t>
+      </w:r>
       <w:r>
         <w:rPr>
           <w:b/>
@@ -746,10 +739,9 @@
     </w:p>
     <w:p/>
     <w:p>
-      <w:pPr>
-        <w:pStyle w:val="ListNumber"/>
-      </w:pPr>
-      <w:r/>
+      <w:r>
+        <w:t xml:space="preserve">5. </w:t>
+      </w:r>
       <w:r>
         <w:rPr>
           <w:b/>
@@ -1152,11 +1144,8 @@
       </w:r>
     </w:p>
     <w:p>
-      <w:pPr>
-        <w:pStyle w:val="ListNumber"/>
-      </w:pPr>
       <w:r>
-        <w:t xml:space="preserve">Install dependencies: </w:t>
+        <w:t xml:space="preserve">1. Install dependencies: </w:t>
       </w:r>
       <w:r>
         <w:rPr>
@@ -1167,11 +1156,8 @@
       <w:r/>
     </w:p>
     <w:p>
-      <w:pPr>
-        <w:pStyle w:val="ListNumber"/>
-      </w:pPr>
       <w:r>
-        <w:t xml:space="preserve">Ensure your OpenAI API key is in a </w:t>
+        <w:t xml:space="preserve">2. Ensure your OpenAI API key is in a </w:t>
       </w:r>
       <w:r>
         <w:rPr>
@@ -1184,11 +1170,8 @@
       </w:r>
     </w:p>
     <w:p>
-      <w:pPr>
-        <w:pStyle w:val="ListNumber"/>
-      </w:pPr>
       <w:r>
-        <w:t xml:space="preserve">Run the script: </w:t>
+        <w:t xml:space="preserve">3. Run the script: </w:t>
       </w:r>
       <w:r>
         <w:rPr>
@@ -1199,11 +1182,8 @@
       <w:r/>
     </w:p>
     <w:p>
-      <w:pPr>
-        <w:pStyle w:val="ListNumber"/>
-      </w:pPr>
       <w:r>
-        <w:t xml:space="preserve">The system will create a </w:t>
+        <w:t xml:space="preserve">4. The system will create a </w:t>
       </w:r>
       <w:r>
         <w:rPr>

</xml_diff>